<commit_message>
docs(planning): sync ② traceability matrix with actual completion state
Appendix A statuses were all 未启动; updated each PR to its real state
(已实现/已关闭/部分/未启动) linked to the ③ gap matrix, plus a note
that '已实现' means merged+CI-verified while 待真机 items remain open.
Keeps the trilogy internally consistent (it's the reconciliation tool).
</commit_message>
<xml_diff>
--- a/docs/requirements/TrailMate-需求规划文档-v1.0.docx
+++ b/docs/requirements/TrailMate-需求规划文档-v1.0.docx
@@ -9841,6 +9841,19 @@
       </w:r>
     </w:p>
     <w:p/>
+    <w:p>
+      <w:pPr>
+        <w:shd w:fill="F2F4F7" w:color="auto" w:val="clear"/>
+        <w:ind w:left="360"/>
+      </w:pPr>
+      <w:r>
+        <w:rPr>
+          <w:color w:val="444444"/>
+        </w:rPr>
+        <w:t xml:space="preserve">状态与《③ Gap 分析》附录 A 追溯矩阵联动；"已实现"指代码合入 + 夹具/编译验收通过，破坏性真机验收另见 ③（凡标"待真机"者尚未闭环）。</w:t>
+      </w:r>
+    </w:p>
+    <w:p/>
     <w:tbl>
       <w:tblPr>
         <w:tblW w:type="dxa" w:w="9360"/>
@@ -9854,11 +9867,11 @@
         </w:tblBorders>
       </w:tblPr>
       <w:tblGrid>
-        <w:gridCol w:w="2730"/>
-        <w:gridCol w:w="3120"/>
-        <w:gridCol w:w="1170"/>
-        <w:gridCol w:w="1170"/>
-        <w:gridCol w:w="1170"/>
+        <w:gridCol w:w="880"/>
+        <w:gridCol w:w="994"/>
+        <w:gridCol w:w="748"/>
+        <w:gridCol w:w="5990"/>
+        <w:gridCol w:w="748"/>
       </w:tblGrid>
       <w:tr>
         <w:trPr>
@@ -9866,7 +9879,7 @@
         </w:trPr>
         <w:tc>
           <w:tcPr>
-            <w:tcW w:type="dxa" w:w="2730"/>
+            <w:tcW w:type="dxa" w:w="880"/>
             <w:tcBorders>
               <w:top w:val="single" w:color="BBBBBB" w:sz="1"/>
               <w:left w:val="single" w:color="BBBBBB" w:sz="1"/>
@@ -9893,7 +9906,7 @@
         </w:tc>
         <w:tc>
           <w:tcPr>
-            <w:tcW w:type="dxa" w:w="3120"/>
+            <w:tcW w:type="dxa" w:w="994"/>
             <w:tcBorders>
               <w:top w:val="single" w:color="BBBBBB" w:sz="1"/>
               <w:left w:val="single" w:color="BBBBBB" w:sz="1"/>
@@ -9920,7 +9933,7 @@
         </w:tc>
         <w:tc>
           <w:tcPr>
-            <w:tcW w:type="dxa" w:w="1170"/>
+            <w:tcW w:type="dxa" w:w="748"/>
             <w:tcBorders>
               <w:top w:val="single" w:color="BBBBBB" w:sz="1"/>
               <w:left w:val="single" w:color="BBBBBB" w:sz="1"/>
@@ -9947,7 +9960,7 @@
         </w:tc>
         <w:tc>
           <w:tcPr>
-            <w:tcW w:type="dxa" w:w="1170"/>
+            <w:tcW w:type="dxa" w:w="5990"/>
             <w:tcBorders>
               <w:top w:val="single" w:color="BBBBBB" w:sz="1"/>
               <w:left w:val="single" w:color="BBBBBB" w:sz="1"/>
@@ -9974,7 +9987,7 @@
         </w:tc>
         <w:tc>
           <w:tcPr>
-            <w:tcW w:type="dxa" w:w="1170"/>
+            <w:tcW w:type="dxa" w:w="748"/>
             <w:tcBorders>
               <w:top w:val="single" w:color="BBBBBB" w:sz="1"/>
               <w:left w:val="single" w:color="BBBBBB" w:sz="1"/>
@@ -10006,7 +10019,7 @@
         </w:trPr>
         <w:tc>
           <w:tcPr>
-            <w:tcW w:type="dxa" w:w="2730"/>
+            <w:tcW w:type="dxa" w:w="880"/>
             <w:tcBorders>
               <w:top w:val="single" w:color="BBBBBB" w:sz="1"/>
               <w:left w:val="single" w:color="BBBBBB" w:sz="1"/>
@@ -10028,7 +10041,7 @@
         </w:tc>
         <w:tc>
           <w:tcPr>
-            <w:tcW w:type="dxa" w:w="3120"/>
+            <w:tcW w:type="dxa" w:w="994"/>
             <w:tcBorders>
               <w:top w:val="single" w:color="BBBBBB" w:sz="1"/>
               <w:left w:val="single" w:color="BBBBBB" w:sz="1"/>
@@ -10050,7 +10063,7 @@
         </w:tc>
         <w:tc>
           <w:tcPr>
-            <w:tcW w:type="dxa" w:w="1170"/>
+            <w:tcW w:type="dxa" w:w="748"/>
             <w:tcBorders>
               <w:top w:val="single" w:color="BBBBBB" w:sz="1"/>
               <w:left w:val="single" w:color="BBBBBB" w:sz="1"/>
@@ -10072,29 +10085,29 @@
         </w:tc>
         <w:tc>
           <w:tcPr>
-            <w:tcW w:type="dxa" w:w="1170"/>
-            <w:tcBorders>
-              <w:top w:val="single" w:color="BBBBBB" w:sz="1"/>
-              <w:left w:val="single" w:color="BBBBBB" w:sz="1"/>
-              <w:bottom w:val="single" w:color="BBBBBB" w:sz="1"/>
-              <w:right w:val="single" w:color="BBBBBB" w:sz="1"/>
-            </w:tcBorders>
-            <w:tcMar>
-              <w:top w:type="dxa" w:w="60"/>
-              <w:left w:type="dxa" w:w="100"/>
-              <w:bottom w:type="dxa" w:w="60"/>
-              <w:right w:type="dxa" w:w="100"/>
-            </w:tcMar>
-          </w:tcPr>
-          <w:p>
-            <w:r>
-              <w:t xml:space="preserve">未启动</w:t>
-            </w:r>
-          </w:p>
-        </w:tc>
-        <w:tc>
-          <w:tcPr>
-            <w:tcW w:type="dxa" w:w="1170"/>
+            <w:tcW w:type="dxa" w:w="5990"/>
+            <w:tcBorders>
+              <w:top w:val="single" w:color="BBBBBB" w:sz="1"/>
+              <w:left w:val="single" w:color="BBBBBB" w:sz="1"/>
+              <w:bottom w:val="single" w:color="BBBBBB" w:sz="1"/>
+              <w:right w:val="single" w:color="BBBBBB" w:sz="1"/>
+            </w:tcBorders>
+            <w:tcMar>
+              <w:top w:type="dxa" w:w="60"/>
+              <w:left w:type="dxa" w:w="100"/>
+              <w:bottom w:type="dxa" w:w="60"/>
+              <w:right w:type="dxa" w:w="100"/>
+            </w:tcMar>
+          </w:tcPr>
+          <w:p>
+            <w:r>
+              <w:t xml:space="preserve">已实现（短语音落地 + 视频收窄，G-CM-1；待真机录发验收）</w:t>
+            </w:r>
+          </w:p>
+        </w:tc>
+        <w:tc>
+          <w:tcPr>
+            <w:tcW w:type="dxa" w:w="748"/>
             <w:tcBorders>
               <w:top w:val="single" w:color="BBBBBB" w:sz="1"/>
               <w:left w:val="single" w:color="BBBBBB" w:sz="1"/>
@@ -10121,7 +10134,7 @@
         </w:trPr>
         <w:tc>
           <w:tcPr>
-            <w:tcW w:type="dxa" w:w="2730"/>
+            <w:tcW w:type="dxa" w:w="880"/>
             <w:tcBorders>
               <w:top w:val="single" w:color="BBBBBB" w:sz="1"/>
               <w:left w:val="single" w:color="BBBBBB" w:sz="1"/>
@@ -10143,7 +10156,7 @@
         </w:tc>
         <w:tc>
           <w:tcPr>
-            <w:tcW w:type="dxa" w:w="3120"/>
+            <w:tcW w:type="dxa" w:w="994"/>
             <w:tcBorders>
               <w:top w:val="single" w:color="BBBBBB" w:sz="1"/>
               <w:left w:val="single" w:color="BBBBBB" w:sz="1"/>
@@ -10165,7 +10178,7 @@
         </w:tc>
         <w:tc>
           <w:tcPr>
-            <w:tcW w:type="dxa" w:w="1170"/>
+            <w:tcW w:type="dxa" w:w="748"/>
             <w:tcBorders>
               <w:top w:val="single" w:color="BBBBBB" w:sz="1"/>
               <w:left w:val="single" w:color="BBBBBB" w:sz="1"/>
@@ -10187,29 +10200,29 @@
         </w:tc>
         <w:tc>
           <w:tcPr>
-            <w:tcW w:type="dxa" w:w="1170"/>
-            <w:tcBorders>
-              <w:top w:val="single" w:color="BBBBBB" w:sz="1"/>
-              <w:left w:val="single" w:color="BBBBBB" w:sz="1"/>
-              <w:bottom w:val="single" w:color="BBBBBB" w:sz="1"/>
-              <w:right w:val="single" w:color="BBBBBB" w:sz="1"/>
-            </w:tcBorders>
-            <w:tcMar>
-              <w:top w:type="dxa" w:w="60"/>
-              <w:left w:type="dxa" w:w="100"/>
-              <w:bottom w:type="dxa" w:w="60"/>
-              <w:right w:type="dxa" w:w="100"/>
-            </w:tcMar>
-          </w:tcPr>
-          <w:p>
-            <w:r>
-              <w:t xml:space="preserve">未启动</w:t>
-            </w:r>
-          </w:p>
-        </w:tc>
-        <w:tc>
-          <w:tcPr>
-            <w:tcW w:type="dxa" w:w="1170"/>
+            <w:tcW w:type="dxa" w:w="5990"/>
+            <w:tcBorders>
+              <w:top w:val="single" w:color="BBBBBB" w:sz="1"/>
+              <w:left w:val="single" w:color="BBBBBB" w:sz="1"/>
+              <w:bottom w:val="single" w:color="BBBBBB" w:sz="1"/>
+              <w:right w:val="single" w:color="BBBBBB" w:sz="1"/>
+            </w:tcBorders>
+            <w:tcMar>
+              <w:top w:type="dxa" w:w="60"/>
+              <w:left w:type="dxa" w:w="100"/>
+              <w:bottom w:type="dxa" w:w="60"/>
+              <w:right w:type="dxa" w:w="100"/>
+            </w:tcMar>
+          </w:tcPr>
+          <w:p>
+            <w:r>
+              <w:t xml:space="preserve">已实现（蓝牙关/无邻居告警双端，G-DR-1；待真机关蓝牙验收）</w:t>
+            </w:r>
+          </w:p>
+        </w:tc>
+        <w:tc>
+          <w:tcPr>
+            <w:tcW w:type="dxa" w:w="748"/>
             <w:tcBorders>
               <w:top w:val="single" w:color="BBBBBB" w:sz="1"/>
               <w:left w:val="single" w:color="BBBBBB" w:sz="1"/>
@@ -10236,7 +10249,7 @@
         </w:trPr>
         <w:tc>
           <w:tcPr>
-            <w:tcW w:type="dxa" w:w="2730"/>
+            <w:tcW w:type="dxa" w:w="880"/>
             <w:tcBorders>
               <w:top w:val="single" w:color="BBBBBB" w:sz="1"/>
               <w:left w:val="single" w:color="BBBBBB" w:sz="1"/>
@@ -10258,7 +10271,7 @@
         </w:tc>
         <w:tc>
           <w:tcPr>
-            <w:tcW w:type="dxa" w:w="3120"/>
+            <w:tcW w:type="dxa" w:w="994"/>
             <w:tcBorders>
               <w:top w:val="single" w:color="BBBBBB" w:sz="1"/>
               <w:left w:val="single" w:color="BBBBBB" w:sz="1"/>
@@ -10280,7 +10293,7 @@
         </w:tc>
         <w:tc>
           <w:tcPr>
-            <w:tcW w:type="dxa" w:w="1170"/>
+            <w:tcW w:type="dxa" w:w="748"/>
             <w:tcBorders>
               <w:top w:val="single" w:color="BBBBBB" w:sz="1"/>
               <w:left w:val="single" w:color="BBBBBB" w:sz="1"/>
@@ -10302,29 +10315,29 @@
         </w:tc>
         <w:tc>
           <w:tcPr>
-            <w:tcW w:type="dxa" w:w="1170"/>
-            <w:tcBorders>
-              <w:top w:val="single" w:color="BBBBBB" w:sz="1"/>
-              <w:left w:val="single" w:color="BBBBBB" w:sz="1"/>
-              <w:bottom w:val="single" w:color="BBBBBB" w:sz="1"/>
-              <w:right w:val="single" w:color="BBBBBB" w:sz="1"/>
-            </w:tcBorders>
-            <w:tcMar>
-              <w:top w:type="dxa" w:w="60"/>
-              <w:left w:type="dxa" w:w="100"/>
-              <w:bottom w:type="dxa" w:w="60"/>
-              <w:right w:type="dxa" w:w="100"/>
-            </w:tcMar>
-          </w:tcPr>
-          <w:p>
-            <w:r>
-              <w:t xml:space="preserve">未启动</w:t>
-            </w:r>
-          </w:p>
-        </w:tc>
-        <w:tc>
-          <w:tcPr>
-            <w:tcW w:type="dxa" w:w="1170"/>
+            <w:tcW w:type="dxa" w:w="5990"/>
+            <w:tcBorders>
+              <w:top w:val="single" w:color="BBBBBB" w:sz="1"/>
+              <w:left w:val="single" w:color="BBBBBB" w:sz="1"/>
+              <w:bottom w:val="single" w:color="BBBBBB" w:sz="1"/>
+              <w:right w:val="single" w:color="BBBBBB" w:sz="1"/>
+            </w:tcBorders>
+            <w:tcMar>
+              <w:top w:type="dxa" w:w="60"/>
+              <w:left w:type="dxa" w:w="100"/>
+              <w:bottom w:type="dxa" w:w="60"/>
+              <w:right w:type="dxa" w:w="100"/>
+            </w:tcMar>
+          </w:tcPr>
+          <w:p>
+            <w:r>
+              <w:t xml:space="preserve">部分（无邻居/蓝牙关发送提示已上线；送达回执仍缺）</w:t>
+            </w:r>
+          </w:p>
+        </w:tc>
+        <w:tc>
+          <w:tcPr>
+            <w:tcW w:type="dxa" w:w="748"/>
             <w:tcBorders>
               <w:top w:val="single" w:color="BBBBBB" w:sz="1"/>
               <w:left w:val="single" w:color="BBBBBB" w:sz="1"/>
@@ -10351,7 +10364,7 @@
         </w:trPr>
         <w:tc>
           <w:tcPr>
-            <w:tcW w:type="dxa" w:w="2730"/>
+            <w:tcW w:type="dxa" w:w="880"/>
             <w:tcBorders>
               <w:top w:val="single" w:color="BBBBBB" w:sz="1"/>
               <w:left w:val="single" w:color="BBBBBB" w:sz="1"/>
@@ -10373,7 +10386,7 @@
         </w:tc>
         <w:tc>
           <w:tcPr>
-            <w:tcW w:type="dxa" w:w="3120"/>
+            <w:tcW w:type="dxa" w:w="994"/>
             <w:tcBorders>
               <w:top w:val="single" w:color="BBBBBB" w:sz="1"/>
               <w:left w:val="single" w:color="BBBBBB" w:sz="1"/>
@@ -10395,7 +10408,7 @@
         </w:tc>
         <w:tc>
           <w:tcPr>
-            <w:tcW w:type="dxa" w:w="1170"/>
+            <w:tcW w:type="dxa" w:w="748"/>
             <w:tcBorders>
               <w:top w:val="single" w:color="BBBBBB" w:sz="1"/>
               <w:left w:val="single" w:color="BBBBBB" w:sz="1"/>
@@ -10417,29 +10430,29 @@
         </w:tc>
         <w:tc>
           <w:tcPr>
-            <w:tcW w:type="dxa" w:w="1170"/>
-            <w:tcBorders>
-              <w:top w:val="single" w:color="BBBBBB" w:sz="1"/>
-              <w:left w:val="single" w:color="BBBBBB" w:sz="1"/>
-              <w:bottom w:val="single" w:color="BBBBBB" w:sz="1"/>
-              <w:right w:val="single" w:color="BBBBBB" w:sz="1"/>
-            </w:tcBorders>
-            <w:tcMar>
-              <w:top w:type="dxa" w:w="60"/>
-              <w:left w:type="dxa" w:w="100"/>
-              <w:bottom w:type="dxa" w:w="60"/>
-              <w:right w:type="dxa" w:w="100"/>
-            </w:tcMar>
-          </w:tcPr>
-          <w:p>
-            <w:r>
-              <w:t xml:space="preserve">未启动</w:t>
-            </w:r>
-          </w:p>
-        </w:tc>
-        <w:tc>
-          <w:tcPr>
-            <w:tcW w:type="dxa" w:w="1170"/>
+            <w:tcW w:type="dxa" w:w="5990"/>
+            <w:tcBorders>
+              <w:top w:val="single" w:color="BBBBBB" w:sz="1"/>
+              <w:left w:val="single" w:color="BBBBBB" w:sz="1"/>
+              <w:bottom w:val="single" w:color="BBBBBB" w:sz="1"/>
+              <w:right w:val="single" w:color="BBBBBB" w:sz="1"/>
+            </w:tcBorders>
+            <w:tcMar>
+              <w:top w:type="dxa" w:w="60"/>
+              <w:left w:type="dxa" w:w="100"/>
+              <w:bottom w:type="dxa" w:w="60"/>
+              <w:right w:type="dxa" w:w="100"/>
+            </w:tcMar>
+          </w:tcPr>
+          <w:p>
+            <w:r>
+              <w:t xml:space="preserve">已实现（端到端加密 G-CM-3，10 项验收进 CI）</w:t>
+            </w:r>
+          </w:p>
+        </w:tc>
+        <w:tc>
+          <w:tcPr>
+            <w:tcW w:type="dxa" w:w="748"/>
             <w:tcBorders>
               <w:top w:val="single" w:color="BBBBBB" w:sz="1"/>
               <w:left w:val="single" w:color="BBBBBB" w:sz="1"/>
@@ -10466,7 +10479,7 @@
         </w:trPr>
         <w:tc>
           <w:tcPr>
-            <w:tcW w:type="dxa" w:w="2730"/>
+            <w:tcW w:type="dxa" w:w="880"/>
             <w:tcBorders>
               <w:top w:val="single" w:color="BBBBBB" w:sz="1"/>
               <w:left w:val="single" w:color="BBBBBB" w:sz="1"/>
@@ -10488,7 +10501,7 @@
         </w:tc>
         <w:tc>
           <w:tcPr>
-            <w:tcW w:type="dxa" w:w="3120"/>
+            <w:tcW w:type="dxa" w:w="994"/>
             <w:tcBorders>
               <w:top w:val="single" w:color="BBBBBB" w:sz="1"/>
               <w:left w:val="single" w:color="BBBBBB" w:sz="1"/>
@@ -10510,7 +10523,7 @@
         </w:tc>
         <w:tc>
           <w:tcPr>
-            <w:tcW w:type="dxa" w:w="1170"/>
+            <w:tcW w:type="dxa" w:w="748"/>
             <w:tcBorders>
               <w:top w:val="single" w:color="BBBBBB" w:sz="1"/>
               <w:left w:val="single" w:color="BBBBBB" w:sz="1"/>
@@ -10532,29 +10545,29 @@
         </w:tc>
         <w:tc>
           <w:tcPr>
-            <w:tcW w:type="dxa" w:w="1170"/>
-            <w:tcBorders>
-              <w:top w:val="single" w:color="BBBBBB" w:sz="1"/>
-              <w:left w:val="single" w:color="BBBBBB" w:sz="1"/>
-              <w:bottom w:val="single" w:color="BBBBBB" w:sz="1"/>
-              <w:right w:val="single" w:color="BBBBBB" w:sz="1"/>
-            </w:tcBorders>
-            <w:tcMar>
-              <w:top w:type="dxa" w:w="60"/>
-              <w:left w:type="dxa" w:w="100"/>
-              <w:bottom w:type="dxa" w:w="60"/>
-              <w:right w:type="dxa" w:w="100"/>
-            </w:tcMar>
-          </w:tcPr>
-          <w:p>
-            <w:r>
-              <w:t xml:space="preserve">未启动</w:t>
-            </w:r>
-          </w:p>
-        </w:tc>
-        <w:tc>
-          <w:tcPr>
-            <w:tcW w:type="dxa" w:w="1170"/>
+            <w:tcW w:type="dxa" w:w="5990"/>
+            <w:tcBorders>
+              <w:top w:val="single" w:color="BBBBBB" w:sz="1"/>
+              <w:left w:val="single" w:color="BBBBBB" w:sz="1"/>
+              <w:bottom w:val="single" w:color="BBBBBB" w:sz="1"/>
+              <w:right w:val="single" w:color="BBBBBB" w:sz="1"/>
+            </w:tcBorders>
+            <w:tcMar>
+              <w:top w:type="dxa" w:w="60"/>
+              <w:left w:type="dxa" w:w="100"/>
+              <w:bottom w:type="dxa" w:w="60"/>
+              <w:right w:type="dxa" w:w="100"/>
+            </w:tcMar>
+          </w:tcPr>
+          <w:p>
+            <w:r>
+              <w:t xml:space="preserve">已实现（信令 token/限流/大小/IP 上限 G-SEC-1，4 项验收进 CI；TLS=反代要求）</w:t>
+            </w:r>
+          </w:p>
+        </w:tc>
+        <w:tc>
+          <w:tcPr>
+            <w:tcW w:type="dxa" w:w="748"/>
             <w:tcBorders>
               <w:top w:val="single" w:color="BBBBBB" w:sz="1"/>
               <w:left w:val="single" w:color="BBBBBB" w:sz="1"/>
@@ -10581,7 +10594,7 @@
         </w:trPr>
         <w:tc>
           <w:tcPr>
-            <w:tcW w:type="dxa" w:w="2730"/>
+            <w:tcW w:type="dxa" w:w="880"/>
             <w:tcBorders>
               <w:top w:val="single" w:color="BBBBBB" w:sz="1"/>
               <w:left w:val="single" w:color="BBBBBB" w:sz="1"/>
@@ -10603,7 +10616,7 @@
         </w:tc>
         <w:tc>
           <w:tcPr>
-            <w:tcW w:type="dxa" w:w="3120"/>
+            <w:tcW w:type="dxa" w:w="994"/>
             <w:tcBorders>
               <w:top w:val="single" w:color="BBBBBB" w:sz="1"/>
               <w:left w:val="single" w:color="BBBBBB" w:sz="1"/>
@@ -10625,7 +10638,7 @@
         </w:tc>
         <w:tc>
           <w:tcPr>
-            <w:tcW w:type="dxa" w:w="1170"/>
+            <w:tcW w:type="dxa" w:w="748"/>
             <w:tcBorders>
               <w:top w:val="single" w:color="BBBBBB" w:sz="1"/>
               <w:left w:val="single" w:color="BBBBBB" w:sz="1"/>
@@ -10647,29 +10660,29 @@
         </w:tc>
         <w:tc>
           <w:tcPr>
-            <w:tcW w:type="dxa" w:w="1170"/>
-            <w:tcBorders>
-              <w:top w:val="single" w:color="BBBBBB" w:sz="1"/>
-              <w:left w:val="single" w:color="BBBBBB" w:sz="1"/>
-              <w:bottom w:val="single" w:color="BBBBBB" w:sz="1"/>
-              <w:right w:val="single" w:color="BBBBBB" w:sz="1"/>
-            </w:tcBorders>
-            <w:tcMar>
-              <w:top w:type="dxa" w:w="60"/>
-              <w:left w:type="dxa" w:w="100"/>
-              <w:bottom w:type="dxa" w:w="60"/>
-              <w:right w:type="dxa" w:w="100"/>
-            </w:tcMar>
-          </w:tcPr>
-          <w:p>
-            <w:r>
-              <w:t xml:space="preserve">未启动</w:t>
-            </w:r>
-          </w:p>
-        </w:tc>
-        <w:tc>
-          <w:tcPr>
-            <w:tcW w:type="dxa" w:w="1170"/>
+            <w:tcW w:type="dxa" w:w="5990"/>
+            <w:tcBorders>
+              <w:top w:val="single" w:color="BBBBBB" w:sz="1"/>
+              <w:left w:val="single" w:color="BBBBBB" w:sz="1"/>
+              <w:bottom w:val="single" w:color="BBBBBB" w:sz="1"/>
+              <w:right w:val="single" w:color="BBBBBB" w:sz="1"/>
+            </w:tcBorders>
+            <w:tcMar>
+              <w:top w:type="dxa" w:w="60"/>
+              <w:left w:type="dxa" w:w="100"/>
+              <w:bottom w:type="dxa" w:w="60"/>
+              <w:right w:type="dxa" w:w="100"/>
+            </w:tcMar>
+          </w:tcPr>
+          <w:p>
+            <w:r>
+              <w:t xml:space="preserve">已实现（三端账本备份 G-LG-1；Web 往返验收，原生待卸载重装验收）</w:t>
+            </w:r>
+          </w:p>
+        </w:tc>
+        <w:tc>
+          <w:tcPr>
+            <w:tcW w:type="dxa" w:w="748"/>
             <w:tcBorders>
               <w:top w:val="single" w:color="BBBBBB" w:sz="1"/>
               <w:left w:val="single" w:color="BBBBBB" w:sz="1"/>
@@ -10696,7 +10709,7 @@
         </w:trPr>
         <w:tc>
           <w:tcPr>
-            <w:tcW w:type="dxa" w:w="2730"/>
+            <w:tcW w:type="dxa" w:w="880"/>
             <w:tcBorders>
               <w:top w:val="single" w:color="BBBBBB" w:sz="1"/>
               <w:left w:val="single" w:color="BBBBBB" w:sz="1"/>
@@ -10718,7 +10731,7 @@
         </w:tc>
         <w:tc>
           <w:tcPr>
-            <w:tcW w:type="dxa" w:w="3120"/>
+            <w:tcW w:type="dxa" w:w="994"/>
             <w:tcBorders>
               <w:top w:val="single" w:color="BBBBBB" w:sz="1"/>
               <w:left w:val="single" w:color="BBBBBB" w:sz="1"/>
@@ -10740,7 +10753,7 @@
         </w:tc>
         <w:tc>
           <w:tcPr>
-            <w:tcW w:type="dxa" w:w="1170"/>
+            <w:tcW w:type="dxa" w:w="748"/>
             <w:tcBorders>
               <w:top w:val="single" w:color="BBBBBB" w:sz="1"/>
               <w:left w:val="single" w:color="BBBBBB" w:sz="1"/>
@@ -10762,29 +10775,29 @@
         </w:tc>
         <w:tc>
           <w:tcPr>
-            <w:tcW w:type="dxa" w:w="1170"/>
-            <w:tcBorders>
-              <w:top w:val="single" w:color="BBBBBB" w:sz="1"/>
-              <w:left w:val="single" w:color="BBBBBB" w:sz="1"/>
-              <w:bottom w:val="single" w:color="BBBBBB" w:sz="1"/>
-              <w:right w:val="single" w:color="BBBBBB" w:sz="1"/>
-            </w:tcBorders>
-            <w:tcMar>
-              <w:top w:type="dxa" w:w="60"/>
-              <w:left w:type="dxa" w:w="100"/>
-              <w:bottom w:type="dxa" w:w="60"/>
-              <w:right w:type="dxa" w:w="100"/>
-            </w:tcMar>
-          </w:tcPr>
-          <w:p>
-            <w:r>
-              <w:t xml:space="preserve">未启动</w:t>
-            </w:r>
-          </w:p>
-        </w:tc>
-        <w:tc>
-          <w:tcPr>
-            <w:tcW w:type="dxa" w:w="1170"/>
+            <w:tcW w:type="dxa" w:w="5990"/>
+            <w:tcBorders>
+              <w:top w:val="single" w:color="BBBBBB" w:sz="1"/>
+              <w:left w:val="single" w:color="BBBBBB" w:sz="1"/>
+              <w:bottom w:val="single" w:color="BBBBBB" w:sz="1"/>
+              <w:right w:val="single" w:color="BBBBBB" w:sz="1"/>
+            </w:tcBorders>
+            <w:tcMar>
+              <w:top w:type="dxa" w:w="60"/>
+              <w:left w:type="dxa" w:w="100"/>
+              <w:bottom w:type="dxa" w:w="60"/>
+              <w:right w:type="dxa" w:w="100"/>
+            </w:tcMar>
+          </w:tcPr>
+          <w:p>
+            <w:r>
+              <w:t xml:space="preserve">已关闭（摊分一致 G-LG-2 + iOS 单句柄 G-PF-3）</w:t>
+            </w:r>
+          </w:p>
+        </w:tc>
+        <w:tc>
+          <w:tcPr>
+            <w:tcW w:type="dxa" w:w="748"/>
             <w:tcBorders>
               <w:top w:val="single" w:color="BBBBBB" w:sz="1"/>
               <w:left w:val="single" w:color="BBBBBB" w:sz="1"/>
@@ -10811,7 +10824,7 @@
         </w:trPr>
         <w:tc>
           <w:tcPr>
-            <w:tcW w:type="dxa" w:w="2730"/>
+            <w:tcW w:type="dxa" w:w="880"/>
             <w:tcBorders>
               <w:top w:val="single" w:color="BBBBBB" w:sz="1"/>
               <w:left w:val="single" w:color="BBBBBB" w:sz="1"/>
@@ -10833,7 +10846,7 @@
         </w:tc>
         <w:tc>
           <w:tcPr>
-            <w:tcW w:type="dxa" w:w="3120"/>
+            <w:tcW w:type="dxa" w:w="994"/>
             <w:tcBorders>
               <w:top w:val="single" w:color="BBBBBB" w:sz="1"/>
               <w:left w:val="single" w:color="BBBBBB" w:sz="1"/>
@@ -10855,7 +10868,7 @@
         </w:tc>
         <w:tc>
           <w:tcPr>
-            <w:tcW w:type="dxa" w:w="1170"/>
+            <w:tcW w:type="dxa" w:w="748"/>
             <w:tcBorders>
               <w:top w:val="single" w:color="BBBBBB" w:sz="1"/>
               <w:left w:val="single" w:color="BBBBBB" w:sz="1"/>
@@ -10877,29 +10890,29 @@
         </w:tc>
         <w:tc>
           <w:tcPr>
-            <w:tcW w:type="dxa" w:w="1170"/>
-            <w:tcBorders>
-              <w:top w:val="single" w:color="BBBBBB" w:sz="1"/>
-              <w:left w:val="single" w:color="BBBBBB" w:sz="1"/>
-              <w:bottom w:val="single" w:color="BBBBBB" w:sz="1"/>
-              <w:right w:val="single" w:color="BBBBBB" w:sz="1"/>
-            </w:tcBorders>
-            <w:tcMar>
-              <w:top w:type="dxa" w:w="60"/>
-              <w:left w:type="dxa" w:w="100"/>
-              <w:bottom w:type="dxa" w:w="60"/>
-              <w:right w:type="dxa" w:w="100"/>
-            </w:tcMar>
-          </w:tcPr>
-          <w:p>
-            <w:r>
-              <w:t xml:space="preserve">未启动</w:t>
-            </w:r>
-          </w:p>
-        </w:tc>
-        <w:tc>
-          <w:tcPr>
-            <w:tcW w:type="dxa" w:w="1170"/>
+            <w:tcW w:type="dxa" w:w="5990"/>
+            <w:tcBorders>
+              <w:top w:val="single" w:color="BBBBBB" w:sz="1"/>
+              <w:left w:val="single" w:color="BBBBBB" w:sz="1"/>
+              <w:bottom w:val="single" w:color="BBBBBB" w:sz="1"/>
+              <w:right w:val="single" w:color="BBBBBB" w:sz="1"/>
+            </w:tcBorders>
+            <w:tcMar>
+              <w:top w:type="dxa" w:w="60"/>
+              <w:left w:type="dxa" w:w="100"/>
+              <w:bottom w:type="dxa" w:w="60"/>
+              <w:right w:type="dxa" w:w="100"/>
+            </w:tcMar>
+          </w:tcPr>
+          <w:p>
+            <w:r>
+              <w:t xml:space="preserve">已实现（Android 扫描占空比 G-ENG-2）</w:t>
+            </w:r>
+          </w:p>
+        </w:tc>
+        <w:tc>
+          <w:tcPr>
+            <w:tcW w:type="dxa" w:w="748"/>
             <w:tcBorders>
               <w:top w:val="single" w:color="BBBBBB" w:sz="1"/>
               <w:left w:val="single" w:color="BBBBBB" w:sz="1"/>
@@ -10926,7 +10939,7 @@
         </w:trPr>
         <w:tc>
           <w:tcPr>
-            <w:tcW w:type="dxa" w:w="2730"/>
+            <w:tcW w:type="dxa" w:w="880"/>
             <w:tcBorders>
               <w:top w:val="single" w:color="BBBBBB" w:sz="1"/>
               <w:left w:val="single" w:color="BBBBBB" w:sz="1"/>
@@ -10948,7 +10961,7 @@
         </w:tc>
         <w:tc>
           <w:tcPr>
-            <w:tcW w:type="dxa" w:w="3120"/>
+            <w:tcW w:type="dxa" w:w="994"/>
             <w:tcBorders>
               <w:top w:val="single" w:color="BBBBBB" w:sz="1"/>
               <w:left w:val="single" w:color="BBBBBB" w:sz="1"/>
@@ -10970,7 +10983,7 @@
         </w:tc>
         <w:tc>
           <w:tcPr>
-            <w:tcW w:type="dxa" w:w="1170"/>
+            <w:tcW w:type="dxa" w:w="748"/>
             <w:tcBorders>
               <w:top w:val="single" w:color="BBBBBB" w:sz="1"/>
               <w:left w:val="single" w:color="BBBBBB" w:sz="1"/>
@@ -10992,29 +11005,29 @@
         </w:tc>
         <w:tc>
           <w:tcPr>
-            <w:tcW w:type="dxa" w:w="1170"/>
-            <w:tcBorders>
-              <w:top w:val="single" w:color="BBBBBB" w:sz="1"/>
-              <w:left w:val="single" w:color="BBBBBB" w:sz="1"/>
-              <w:bottom w:val="single" w:color="BBBBBB" w:sz="1"/>
-              <w:right w:val="single" w:color="BBBBBB" w:sz="1"/>
-            </w:tcBorders>
-            <w:tcMar>
-              <w:top w:type="dxa" w:w="60"/>
-              <w:left w:type="dxa" w:w="100"/>
-              <w:bottom w:type="dxa" w:w="60"/>
-              <w:right w:type="dxa" w:w="100"/>
-            </w:tcMar>
-          </w:tcPr>
-          <w:p>
-            <w:r>
-              <w:t xml:space="preserve">未启动</w:t>
-            </w:r>
-          </w:p>
-        </w:tc>
-        <w:tc>
-          <w:tcPr>
-            <w:tcW w:type="dxa" w:w="1170"/>
+            <w:tcW w:type="dxa" w:w="5990"/>
+            <w:tcBorders>
+              <w:top w:val="single" w:color="BBBBBB" w:sz="1"/>
+              <w:left w:val="single" w:color="BBBBBB" w:sz="1"/>
+              <w:bottom w:val="single" w:color="BBBBBB" w:sz="1"/>
+              <w:right w:val="single" w:color="BBBBBB" w:sz="1"/>
+            </w:tcBorders>
+            <w:tcMar>
+              <w:top w:type="dxa" w:w="60"/>
+              <w:left w:type="dxa" w:w="100"/>
+              <w:bottom w:type="dxa" w:w="60"/>
+              <w:right w:type="dxa" w:w="100"/>
+            </w:tcMar>
+          </w:tcPr>
+          <w:p>
+            <w:r>
+              <w:t xml:space="preserve">已实现（在线态 15s 变淡/60s 移除 G-DR-2）</w:t>
+            </w:r>
+          </w:p>
+        </w:tc>
+        <w:tc>
+          <w:tcPr>
+            <w:tcW w:type="dxa" w:w="748"/>
             <w:tcBorders>
               <w:top w:val="single" w:color="BBBBBB" w:sz="1"/>
               <w:left w:val="single" w:color="BBBBBB" w:sz="1"/>
@@ -11041,7 +11054,7 @@
         </w:trPr>
         <w:tc>
           <w:tcPr>
-            <w:tcW w:type="dxa" w:w="2730"/>
+            <w:tcW w:type="dxa" w:w="880"/>
             <w:tcBorders>
               <w:top w:val="single" w:color="BBBBBB" w:sz="1"/>
               <w:left w:val="single" w:color="BBBBBB" w:sz="1"/>
@@ -11063,7 +11076,7 @@
         </w:tc>
         <w:tc>
           <w:tcPr>
-            <w:tcW w:type="dxa" w:w="3120"/>
+            <w:tcW w:type="dxa" w:w="994"/>
             <w:tcBorders>
               <w:top w:val="single" w:color="BBBBBB" w:sz="1"/>
               <w:left w:val="single" w:color="BBBBBB" w:sz="1"/>
@@ -11085,7 +11098,7 @@
         </w:tc>
         <w:tc>
           <w:tcPr>
-            <w:tcW w:type="dxa" w:w="1170"/>
+            <w:tcW w:type="dxa" w:w="748"/>
             <w:tcBorders>
               <w:top w:val="single" w:color="BBBBBB" w:sz="1"/>
               <w:left w:val="single" w:color="BBBBBB" w:sz="1"/>
@@ -11107,29 +11120,29 @@
         </w:tc>
         <w:tc>
           <w:tcPr>
-            <w:tcW w:type="dxa" w:w="1170"/>
-            <w:tcBorders>
-              <w:top w:val="single" w:color="BBBBBB" w:sz="1"/>
-              <w:left w:val="single" w:color="BBBBBB" w:sz="1"/>
-              <w:bottom w:val="single" w:color="BBBBBB" w:sz="1"/>
-              <w:right w:val="single" w:color="BBBBBB" w:sz="1"/>
-            </w:tcBorders>
-            <w:tcMar>
-              <w:top w:type="dxa" w:w="60"/>
-              <w:left w:type="dxa" w:w="100"/>
-              <w:bottom w:type="dxa" w:w="60"/>
-              <w:right w:type="dxa" w:w="100"/>
-            </w:tcMar>
-          </w:tcPr>
-          <w:p>
-            <w:r>
-              <w:t xml:space="preserve">未启动</w:t>
-            </w:r>
-          </w:p>
-        </w:tc>
-        <w:tc>
-          <w:tcPr>
-            <w:tcW w:type="dxa" w:w="1170"/>
+            <w:tcW w:type="dxa" w:w="5990"/>
+            <w:tcBorders>
+              <w:top w:val="single" w:color="BBBBBB" w:sz="1"/>
+              <w:left w:val="single" w:color="BBBBBB" w:sz="1"/>
+              <w:bottom w:val="single" w:color="BBBBBB" w:sz="1"/>
+              <w:right w:val="single" w:color="BBBBBB" w:sz="1"/>
+            </w:tcBorders>
+            <w:tcMar>
+              <w:top w:type="dxa" w:w="60"/>
+              <w:left w:type="dxa" w:w="100"/>
+              <w:bottom w:type="dxa" w:w="60"/>
+              <w:right w:type="dxa" w:w="100"/>
+            </w:tcMar>
+          </w:tcPr>
+          <w:p>
+            <w:r>
+              <w:t xml:space="preserve">已实现（Android 变声 9 预设对齐 iOS G-VC-1）</w:t>
+            </w:r>
+          </w:p>
+        </w:tc>
+        <w:tc>
+          <w:tcPr>
+            <w:tcW w:type="dxa" w:w="748"/>
             <w:tcBorders>
               <w:top w:val="single" w:color="BBBBBB" w:sz="1"/>
               <w:left w:val="single" w:color="BBBBBB" w:sz="1"/>
@@ -11156,7 +11169,7 @@
         </w:trPr>
         <w:tc>
           <w:tcPr>
-            <w:tcW w:type="dxa" w:w="2730"/>
+            <w:tcW w:type="dxa" w:w="880"/>
             <w:tcBorders>
               <w:top w:val="single" w:color="BBBBBB" w:sz="1"/>
               <w:left w:val="single" w:color="BBBBBB" w:sz="1"/>
@@ -11178,7 +11191,7 @@
         </w:tc>
         <w:tc>
           <w:tcPr>
-            <w:tcW w:type="dxa" w:w="3120"/>
+            <w:tcW w:type="dxa" w:w="994"/>
             <w:tcBorders>
               <w:top w:val="single" w:color="BBBBBB" w:sz="1"/>
               <w:left w:val="single" w:color="BBBBBB" w:sz="1"/>
@@ -11200,7 +11213,7 @@
         </w:tc>
         <w:tc>
           <w:tcPr>
-            <w:tcW w:type="dxa" w:w="1170"/>
+            <w:tcW w:type="dxa" w:w="748"/>
             <w:tcBorders>
               <w:top w:val="single" w:color="BBBBBB" w:sz="1"/>
               <w:left w:val="single" w:color="BBBBBB" w:sz="1"/>
@@ -11222,29 +11235,29 @@
         </w:tc>
         <w:tc>
           <w:tcPr>
-            <w:tcW w:type="dxa" w:w="1170"/>
-            <w:tcBorders>
-              <w:top w:val="single" w:color="BBBBBB" w:sz="1"/>
-              <w:left w:val="single" w:color="BBBBBB" w:sz="1"/>
-              <w:bottom w:val="single" w:color="BBBBBB" w:sz="1"/>
-              <w:right w:val="single" w:color="BBBBBB" w:sz="1"/>
-            </w:tcBorders>
-            <w:tcMar>
-              <w:top w:type="dxa" w:w="60"/>
-              <w:left w:type="dxa" w:w="100"/>
-              <w:bottom w:type="dxa" w:w="60"/>
-              <w:right w:type="dxa" w:w="100"/>
-            </w:tcMar>
-          </w:tcPr>
-          <w:p>
-            <w:r>
-              <w:t xml:space="preserve">未启动</w:t>
-            </w:r>
-          </w:p>
-        </w:tc>
-        <w:tc>
-          <w:tcPr>
-            <w:tcW w:type="dxa" w:w="1170"/>
+            <w:tcW w:type="dxa" w:w="5990"/>
+            <w:tcBorders>
+              <w:top w:val="single" w:color="BBBBBB" w:sz="1"/>
+              <w:left w:val="single" w:color="BBBBBB" w:sz="1"/>
+              <w:bottom w:val="single" w:color="BBBBBB" w:sz="1"/>
+              <w:right w:val="single" w:color="BBBBBB" w:sz="1"/>
+            </w:tcBorders>
+            <w:tcMar>
+              <w:top w:type="dxa" w:w="60"/>
+              <w:left w:type="dxa" w:w="100"/>
+              <w:bottom w:type="dxa" w:w="60"/>
+              <w:right w:type="dxa" w:w="100"/>
+            </w:tcMar>
+          </w:tcPr>
+          <w:p>
+            <w:r>
+              <w:t xml:space="preserve">已实现（Android 小票 OCR G-LG-3）</w:t>
+            </w:r>
+          </w:p>
+        </w:tc>
+        <w:tc>
+          <w:tcPr>
+            <w:tcW w:type="dxa" w:w="748"/>
             <w:tcBorders>
               <w:top w:val="single" w:color="BBBBBB" w:sz="1"/>
               <w:left w:val="single" w:color="BBBBBB" w:sz="1"/>
@@ -11271,7 +11284,7 @@
         </w:trPr>
         <w:tc>
           <w:tcPr>
-            <w:tcW w:type="dxa" w:w="2730"/>
+            <w:tcW w:type="dxa" w:w="880"/>
             <w:tcBorders>
               <w:top w:val="single" w:color="BBBBBB" w:sz="1"/>
               <w:left w:val="single" w:color="BBBBBB" w:sz="1"/>
@@ -11293,7 +11306,7 @@
         </w:tc>
         <w:tc>
           <w:tcPr>
-            <w:tcW w:type="dxa" w:w="3120"/>
+            <w:tcW w:type="dxa" w:w="994"/>
             <w:tcBorders>
               <w:top w:val="single" w:color="BBBBBB" w:sz="1"/>
               <w:left w:val="single" w:color="BBBBBB" w:sz="1"/>
@@ -11315,7 +11328,7 @@
         </w:tc>
         <w:tc>
           <w:tcPr>
-            <w:tcW w:type="dxa" w:w="1170"/>
+            <w:tcW w:type="dxa" w:w="748"/>
             <w:tcBorders>
               <w:top w:val="single" w:color="BBBBBB" w:sz="1"/>
               <w:left w:val="single" w:color="BBBBBB" w:sz="1"/>
@@ -11337,29 +11350,29 @@
         </w:tc>
         <w:tc>
           <w:tcPr>
-            <w:tcW w:type="dxa" w:w="1170"/>
-            <w:tcBorders>
-              <w:top w:val="single" w:color="BBBBBB" w:sz="1"/>
-              <w:left w:val="single" w:color="BBBBBB" w:sz="1"/>
-              <w:bottom w:val="single" w:color="BBBBBB" w:sz="1"/>
-              <w:right w:val="single" w:color="BBBBBB" w:sz="1"/>
-            </w:tcBorders>
-            <w:tcMar>
-              <w:top w:type="dxa" w:w="60"/>
-              <w:left w:type="dxa" w:w="100"/>
-              <w:bottom w:type="dxa" w:w="60"/>
-              <w:right w:type="dxa" w:w="100"/>
-            </w:tcMar>
-          </w:tcPr>
-          <w:p>
-            <w:r>
-              <w:t xml:space="preserve">未启动</w:t>
-            </w:r>
-          </w:p>
-        </w:tc>
-        <w:tc>
-          <w:tcPr>
-            <w:tcW w:type="dxa" w:w="1170"/>
+            <w:tcW w:type="dxa" w:w="5990"/>
+            <w:tcBorders>
+              <w:top w:val="single" w:color="BBBBBB" w:sz="1"/>
+              <w:left w:val="single" w:color="BBBBBB" w:sz="1"/>
+              <w:bottom w:val="single" w:color="BBBBBB" w:sz="1"/>
+              <w:right w:val="single" w:color="BBBBBB" w:sz="1"/>
+            </w:tcBorders>
+            <w:tcMar>
+              <w:top w:type="dxa" w:w="60"/>
+              <w:left w:type="dxa" w:w="100"/>
+              <w:bottom w:type="dxa" w:w="60"/>
+              <w:right w:type="dxa" w:w="100"/>
+            </w:tcMar>
+          </w:tcPr>
+          <w:p>
+            <w:r>
+              <w:t xml:space="preserve">已实现（隐身开关 G-DR-3）</w:t>
+            </w:r>
+          </w:p>
+        </w:tc>
+        <w:tc>
+          <w:tcPr>
+            <w:tcW w:type="dxa" w:w="748"/>
             <w:tcBorders>
               <w:top w:val="single" w:color="BBBBBB" w:sz="1"/>
               <w:left w:val="single" w:color="BBBBBB" w:sz="1"/>
@@ -11386,7 +11399,7 @@
         </w:trPr>
         <w:tc>
           <w:tcPr>
-            <w:tcW w:type="dxa" w:w="2730"/>
+            <w:tcW w:type="dxa" w:w="880"/>
             <w:tcBorders>
               <w:top w:val="single" w:color="BBBBBB" w:sz="1"/>
               <w:left w:val="single" w:color="BBBBBB" w:sz="1"/>
@@ -11408,7 +11421,7 @@
         </w:tc>
         <w:tc>
           <w:tcPr>
-            <w:tcW w:type="dxa" w:w="3120"/>
+            <w:tcW w:type="dxa" w:w="994"/>
             <w:tcBorders>
               <w:top w:val="single" w:color="BBBBBB" w:sz="1"/>
               <w:left w:val="single" w:color="BBBBBB" w:sz="1"/>
@@ -11430,7 +11443,7 @@
         </w:tc>
         <w:tc>
           <w:tcPr>
-            <w:tcW w:type="dxa" w:w="1170"/>
+            <w:tcW w:type="dxa" w:w="748"/>
             <w:tcBorders>
               <w:top w:val="single" w:color="BBBBBB" w:sz="1"/>
               <w:left w:val="single" w:color="BBBBBB" w:sz="1"/>
@@ -11452,7 +11465,7 @@
         </w:tc>
         <w:tc>
           <w:tcPr>
-            <w:tcW w:type="dxa" w:w="1170"/>
+            <w:tcW w:type="dxa" w:w="5990"/>
             <w:tcBorders>
               <w:top w:val="single" w:color="BBBBBB" w:sz="1"/>
               <w:left w:val="single" w:color="BBBBBB" w:sz="1"/>
@@ -11474,7 +11487,7 @@
         </w:tc>
         <w:tc>
           <w:tcPr>
-            <w:tcW w:type="dxa" w:w="1170"/>
+            <w:tcW w:type="dxa" w:w="748"/>
             <w:tcBorders>
               <w:top w:val="single" w:color="BBBBBB" w:sz="1"/>
               <w:left w:val="single" w:color="BBBBBB" w:sz="1"/>
@@ -11501,7 +11514,7 @@
         </w:trPr>
         <w:tc>
           <w:tcPr>
-            <w:tcW w:type="dxa" w:w="2730"/>
+            <w:tcW w:type="dxa" w:w="880"/>
             <w:tcBorders>
               <w:top w:val="single" w:color="BBBBBB" w:sz="1"/>
               <w:left w:val="single" w:color="BBBBBB" w:sz="1"/>
@@ -11523,7 +11536,7 @@
         </w:tc>
         <w:tc>
           <w:tcPr>
-            <w:tcW w:type="dxa" w:w="3120"/>
+            <w:tcW w:type="dxa" w:w="994"/>
             <w:tcBorders>
               <w:top w:val="single" w:color="BBBBBB" w:sz="1"/>
               <w:left w:val="single" w:color="BBBBBB" w:sz="1"/>
@@ -11545,7 +11558,7 @@
         </w:tc>
         <w:tc>
           <w:tcPr>
-            <w:tcW w:type="dxa" w:w="1170"/>
+            <w:tcW w:type="dxa" w:w="748"/>
             <w:tcBorders>
               <w:top w:val="single" w:color="BBBBBB" w:sz="1"/>
               <w:left w:val="single" w:color="BBBBBB" w:sz="1"/>
@@ -11567,29 +11580,29 @@
         </w:tc>
         <w:tc>
           <w:tcPr>
-            <w:tcW w:type="dxa" w:w="1170"/>
-            <w:tcBorders>
-              <w:top w:val="single" w:color="BBBBBB" w:sz="1"/>
-              <w:left w:val="single" w:color="BBBBBB" w:sz="1"/>
-              <w:bottom w:val="single" w:color="BBBBBB" w:sz="1"/>
-              <w:right w:val="single" w:color="BBBBBB" w:sz="1"/>
-            </w:tcBorders>
-            <w:tcMar>
-              <w:top w:type="dxa" w:w="60"/>
-              <w:left w:type="dxa" w:w="100"/>
-              <w:bottom w:type="dxa" w:w="60"/>
-              <w:right w:type="dxa" w:w="100"/>
-            </w:tcMar>
-          </w:tcPr>
-          <w:p>
-            <w:r>
-              <w:t xml:space="preserve">未启动</w:t>
-            </w:r>
-          </w:p>
-        </w:tc>
-        <w:tc>
-          <w:tcPr>
-            <w:tcW w:type="dxa" w:w="1170"/>
+            <w:tcW w:type="dxa" w:w="5990"/>
+            <w:tcBorders>
+              <w:top w:val="single" w:color="BBBBBB" w:sz="1"/>
+              <w:left w:val="single" w:color="BBBBBB" w:sz="1"/>
+              <w:bottom w:val="single" w:color="BBBBBB" w:sz="1"/>
+              <w:right w:val="single" w:color="BBBBBB" w:sz="1"/>
+            </w:tcBorders>
+            <w:tcMar>
+              <w:top w:type="dxa" w:w="60"/>
+              <w:left w:type="dxa" w:w="100"/>
+              <w:bottom w:type="dxa" w:w="60"/>
+              <w:right w:type="dxa" w:w="100"/>
+            </w:tcMar>
+          </w:tcPr>
+          <w:p>
+            <w:r>
+              <w:t xml:space="preserve">已实现（WSOLA 保时长变调 G-VC-2，主频精确 ×f 验收进 CI）</w:t>
+            </w:r>
+          </w:p>
+        </w:tc>
+        <w:tc>
+          <w:tcPr>
+            <w:tcW w:type="dxa" w:w="748"/>
             <w:tcBorders>
               <w:top w:val="single" w:color="BBBBBB" w:sz="1"/>
               <w:left w:val="single" w:color="BBBBBB" w:sz="1"/>
@@ -11616,7 +11629,7 @@
         </w:trPr>
         <w:tc>
           <w:tcPr>
-            <w:tcW w:type="dxa" w:w="2730"/>
+            <w:tcW w:type="dxa" w:w="880"/>
             <w:tcBorders>
               <w:top w:val="single" w:color="BBBBBB" w:sz="1"/>
               <w:left w:val="single" w:color="BBBBBB" w:sz="1"/>
@@ -11638,7 +11651,7 @@
         </w:tc>
         <w:tc>
           <w:tcPr>
-            <w:tcW w:type="dxa" w:w="3120"/>
+            <w:tcW w:type="dxa" w:w="994"/>
             <w:tcBorders>
               <w:top w:val="single" w:color="BBBBBB" w:sz="1"/>
               <w:left w:val="single" w:color="BBBBBB" w:sz="1"/>
@@ -11660,7 +11673,7 @@
         </w:tc>
         <w:tc>
           <w:tcPr>
-            <w:tcW w:type="dxa" w:w="1170"/>
+            <w:tcW w:type="dxa" w:w="748"/>
             <w:tcBorders>
               <w:top w:val="single" w:color="BBBBBB" w:sz="1"/>
               <w:left w:val="single" w:color="BBBBBB" w:sz="1"/>
@@ -11682,7 +11695,7 @@
         </w:tc>
         <w:tc>
           <w:tcPr>
-            <w:tcW w:type="dxa" w:w="1170"/>
+            <w:tcW w:type="dxa" w:w="5990"/>
             <w:tcBorders>
               <w:top w:val="single" w:color="BBBBBB" w:sz="1"/>
               <w:left w:val="single" w:color="BBBBBB" w:sz="1"/>
@@ -11704,7 +11717,7 @@
         </w:tc>
         <w:tc>
           <w:tcPr>
-            <w:tcW w:type="dxa" w:w="1170"/>
+            <w:tcW w:type="dxa" w:w="748"/>
             <w:tcBorders>
               <w:top w:val="single" w:color="BBBBBB" w:sz="1"/>
               <w:left w:val="single" w:color="BBBBBB" w:sz="1"/>
@@ -11731,7 +11744,7 @@
         </w:trPr>
         <w:tc>
           <w:tcPr>
-            <w:tcW w:type="dxa" w:w="2730"/>
+            <w:tcW w:type="dxa" w:w="880"/>
             <w:tcBorders>
               <w:top w:val="single" w:color="BBBBBB" w:sz="1"/>
               <w:left w:val="single" w:color="BBBBBB" w:sz="1"/>
@@ -11753,7 +11766,7 @@
         </w:tc>
         <w:tc>
           <w:tcPr>
-            <w:tcW w:type="dxa" w:w="3120"/>
+            <w:tcW w:type="dxa" w:w="994"/>
             <w:tcBorders>
               <w:top w:val="single" w:color="BBBBBB" w:sz="1"/>
               <w:left w:val="single" w:color="BBBBBB" w:sz="1"/>
@@ -11775,7 +11788,7 @@
         </w:tc>
         <w:tc>
           <w:tcPr>
-            <w:tcW w:type="dxa" w:w="1170"/>
+            <w:tcW w:type="dxa" w:w="748"/>
             <w:tcBorders>
               <w:top w:val="single" w:color="BBBBBB" w:sz="1"/>
               <w:left w:val="single" w:color="BBBBBB" w:sz="1"/>
@@ -11797,7 +11810,7 @@
         </w:tc>
         <w:tc>
           <w:tcPr>
-            <w:tcW w:type="dxa" w:w="1170"/>
+            <w:tcW w:type="dxa" w:w="5990"/>
             <w:tcBorders>
               <w:top w:val="single" w:color="BBBBBB" w:sz="1"/>
               <w:left w:val="single" w:color="BBBBBB" w:sz="1"/>
@@ -11819,7 +11832,7 @@
         </w:tc>
         <w:tc>
           <w:tcPr>
-            <w:tcW w:type="dxa" w:w="1170"/>
+            <w:tcW w:type="dxa" w:w="748"/>
             <w:tcBorders>
               <w:top w:val="single" w:color="BBBBBB" w:sz="1"/>
               <w:left w:val="single" w:color="BBBBBB" w:sz="1"/>

</xml_diff>